<commit_message>
Update onderzoeken & ontwerpen
Gebruikersonderzoek, Ballasttank onderzoek en architectuurontwerp aangepast op basis van de feedback. Gebruikersonderzoek kan nog een beetje extra gebruiken.
</commit_message>
<xml_diff>
--- a/Opleverset/Documentatie/Onderzoeken/Ballasttank onderzoek.docx
+++ b/Opleverset/Documentatie/Onderzoeken/Ballasttank onderzoek.docx
@@ -25,7 +25,7 @@
         <w:p/>
         <w:p>
           <w:pPr>
-            <w:pStyle w:val="Titel"/>
+            <w:pStyle w:val="Title"/>
           </w:pPr>
           <w:r>
             <w:rPr>
@@ -453,7 +453,7 @@
                             <w:txbxContent>
                               <w:p>
                                 <w:pPr>
-                                  <w:pStyle w:val="Geenafstand"/>
+                                  <w:pStyle w:val="NoSpacing"/>
                                   <w:rPr>
                                     <w:color w:val="7F7F7F" w:themeColor="text1" w:themeTint="80"/>
                                     <w:sz w:val="18"/>
@@ -560,7 +560,7 @@
                       <w:txbxContent>
                         <w:p>
                           <w:pPr>
-                            <w:pStyle w:val="Geenafstand"/>
+                            <w:pStyle w:val="NoSpacing"/>
                             <w:rPr>
                               <w:color w:val="7F7F7F" w:themeColor="text1" w:themeTint="80"/>
                               <w:sz w:val="18"/>
@@ -724,7 +724,7 @@
                                 <w:sdtContent>
                                   <w:p>
                                     <w:pPr>
-                                      <w:pStyle w:val="Geenafstand"/>
+                                      <w:pStyle w:val="NoSpacing"/>
                                       <w:spacing w:before="40" w:after="40"/>
                                       <w:rPr>
                                         <w:caps/>
@@ -747,7 +747,7 @@
                               </w:sdt>
                               <w:p>
                                 <w:pPr>
-                                  <w:pStyle w:val="Geenafstand"/>
+                                  <w:pStyle w:val="NoSpacing"/>
                                   <w:spacing w:before="40" w:after="40"/>
                                   <w:rPr>
                                     <w:caps/>
@@ -948,7 +948,7 @@
                                 <w:sdtContent>
                                   <w:p>
                                     <w:pPr>
-                                      <w:pStyle w:val="Geenafstand"/>
+                                      <w:pStyle w:val="NoSpacing"/>
                                       <w:jc w:val="right"/>
                                       <w:rPr>
                                         <w:color w:val="FFFFFF" w:themeColor="background1"/>
@@ -1104,7 +1104,7 @@
           <w:sdtContent>
             <w:p>
               <w:pPr>
-                <w:pStyle w:val="Kopvaninhoudsopgave"/>
+                <w:pStyle w:val="TOCHeading"/>
               </w:pPr>
               <w:r>
                 <w:rPr>
@@ -1115,7 +1115,7 @@
             </w:p>
             <w:p>
               <w:pPr>
-                <w:pStyle w:val="Inhopg1"/>
+                <w:pStyle w:val="TOC1"/>
                 <w:tabs>
                   <w:tab w:val="right" w:leader="dot" w:pos="9062"/>
                 </w:tabs>
@@ -1197,7 +1197,7 @@
             </w:p>
             <w:p>
               <w:pPr>
-                <w:pStyle w:val="Inhopg1"/>
+                <w:pStyle w:val="TOC1"/>
                 <w:tabs>
                   <w:tab w:val="right" w:leader="dot" w:pos="9062"/>
                 </w:tabs>
@@ -1270,7 +1270,7 @@
             </w:p>
             <w:p>
               <w:pPr>
-                <w:pStyle w:val="Inhopg1"/>
+                <w:pStyle w:val="TOC1"/>
                 <w:tabs>
                   <w:tab w:val="right" w:leader="dot" w:pos="9062"/>
                 </w:tabs>
@@ -1343,7 +1343,7 @@
             </w:p>
             <w:p>
               <w:pPr>
-                <w:pStyle w:val="Inhopg1"/>
+                <w:pStyle w:val="TOC1"/>
                 <w:tabs>
                   <w:tab w:val="right" w:leader="dot" w:pos="9062"/>
                 </w:tabs>
@@ -1416,7 +1416,7 @@
             </w:p>
             <w:p>
               <w:pPr>
-                <w:pStyle w:val="Inhopg1"/>
+                <w:pStyle w:val="TOC1"/>
                 <w:tabs>
                   <w:tab w:val="right" w:leader="dot" w:pos="9062"/>
                 </w:tabs>
@@ -1489,7 +1489,7 @@
             </w:p>
             <w:p>
               <w:pPr>
-                <w:pStyle w:val="Inhopg1"/>
+                <w:pStyle w:val="TOC1"/>
                 <w:tabs>
                   <w:tab w:val="right" w:leader="dot" w:pos="9062"/>
                 </w:tabs>
@@ -1562,7 +1562,7 @@
             </w:p>
             <w:p>
               <w:pPr>
-                <w:pStyle w:val="Inhopg1"/>
+                <w:pStyle w:val="TOC1"/>
                 <w:tabs>
                   <w:tab w:val="right" w:leader="dot" w:pos="9062"/>
                 </w:tabs>
@@ -1635,7 +1635,7 @@
             </w:p>
             <w:p>
               <w:pPr>
-                <w:pStyle w:val="Inhopg1"/>
+                <w:pStyle w:val="TOC1"/>
                 <w:tabs>
                   <w:tab w:val="right" w:leader="dot" w:pos="9062"/>
                 </w:tabs>
@@ -1708,7 +1708,7 @@
             </w:p>
             <w:p>
               <w:pPr>
-                <w:pStyle w:val="Inhopg1"/>
+                <w:pStyle w:val="TOC1"/>
                 <w:tabs>
                   <w:tab w:val="right" w:leader="dot" w:pos="9062"/>
                 </w:tabs>
@@ -1781,7 +1781,7 @@
             </w:p>
             <w:p>
               <w:pPr>
-                <w:pStyle w:val="Inhopg1"/>
+                <w:pStyle w:val="TOC1"/>
                 <w:tabs>
                   <w:tab w:val="right" w:leader="dot" w:pos="9062"/>
                 </w:tabs>
@@ -1853,7 +1853,7 @@
             </w:p>
             <w:p>
               <w:pPr>
-                <w:pStyle w:val="Inhopg1"/>
+                <w:pStyle w:val="TOC1"/>
                 <w:tabs>
                   <w:tab w:val="right" w:leader="dot" w:pos="9062"/>
                 </w:tabs>
@@ -1960,7 +1960,7 @@
           <w:bookmarkStart w:id="0" w:name="_Toc213669760"/>
           <w:r>
             <w:rPr>
-              <w:rStyle w:val="Kop1Char"/>
+              <w:rStyle w:val="Heading1Char"/>
               <w:lang w:val="nl-NL"/>
             </w:rPr>
             <w:lastRenderedPageBreak/>
@@ -2012,7 +2012,7 @@
           </w:pPr>
           <w:r>
             <w:rPr>
-              <w:rStyle w:val="Kop1Char"/>
+              <w:rStyle w:val="Heading1Char"/>
               <w:lang w:val="nl-NL"/>
             </w:rPr>
             <w:t>Inleiding</w:t>
@@ -2034,7 +2034,53 @@
             <w:rPr>
               <w:lang w:val="nl-NL"/>
             </w:rPr>
-            <w:t>Hierbij een onderzoek over Ballasttanks, aangezien aangeleverde data (Tabel 11, paragraaf 7.3.2, Scriptie Jelle-Willemen)</w:t>
+            <w:t>Aangezien wij</w:t>
+          </w:r>
+          <w:r>
+            <w:rPr>
+              <w:lang w:val="nl-NL"/>
+            </w:rPr>
+            <w:t xml:space="preserve">, met behulp van de </w:t>
+          </w:r>
+          <w:r>
+            <w:rPr>
+              <w:lang w:val="nl-NL"/>
+            </w:rPr>
+            <w:t>aangeleverde data (</w:t>
+          </w:r>
+          <w:r>
+            <w:rPr>
+              <w:i/>
+              <w:iCs/>
+              <w:lang w:val="nl-NL"/>
+            </w:rPr>
+            <w:t>Tabel 11, paragraaf 7.3.2, Scriptie Jelle-Willemen</w:t>
+          </w:r>
+          <w:r>
+            <w:rPr>
+              <w:i/>
+              <w:iCs/>
+              <w:lang w:val="nl-NL"/>
+            </w:rPr>
+            <w:t>,</w:t>
+          </w:r>
+          <w:r>
+            <w:rPr>
+              <w:lang w:val="nl-NL"/>
+            </w:rPr>
+            <w:t xml:space="preserve"> gekozen hebben om ballasttanks te gebruiken, moeten we het juiste onderzoek uitvoeren. Er blijkt dat er heel erg veel verschillende soorten ballasttanks zijn, hebben we h</w:t>
+          </w:r>
+          <w:r>
+            <w:rPr>
+              <w:lang w:val="nl-NL"/>
+            </w:rPr>
+            <w:t>ierbij een onderzoek over Ballasttanks</w:t>
+          </w:r>
+          <w:r>
+            <w:rPr>
+              <w:lang w:val="nl-NL"/>
+            </w:rPr>
+            <w:t>.</w:t>
           </w:r>
           <w:r>
             <w:rPr>
@@ -2042,23 +2088,17 @@
             </w:rPr>
             <w:t xml:space="preserve"> </w:t>
           </w:r>
-          <w:r>
-            <w:rPr>
-              <w:lang w:val="nl-NL"/>
-            </w:rPr>
-            <w:t xml:space="preserve">aangegeven heeft dat ballasttanks de beste optie zijn voor een dynamisch balanssysteem. </w:t>
-          </w:r>
         </w:p>
         <w:p>
           <w:pPr>
             <w:rPr>
-              <w:rStyle w:val="Kop2Char"/>
+              <w:rStyle w:val="Heading2Char"/>
               <w:lang w:val="nl-NL"/>
             </w:rPr>
           </w:pPr>
           <w:r>
             <w:rPr>
-              <w:rStyle w:val="Kop2Char"/>
+              <w:rStyle w:val="Heading2Char"/>
               <w:lang w:val="nl-NL"/>
             </w:rPr>
             <w:t>Probleemstelling</w:t>
@@ -2067,7 +2107,7 @@
         <w:p>
           <w:pPr>
             <w:rPr>
-              <w:rStyle w:val="Kop2Char"/>
+              <w:rStyle w:val="Heading2Char"/>
               <w:lang w:val="nl-NL"/>
             </w:rPr>
           </w:pPr>
@@ -2080,7 +2120,7 @@
         </w:p>
         <w:p>
           <w:pPr>
-            <w:pStyle w:val="Kop2"/>
+            <w:pStyle w:val="Heading2"/>
             <w:rPr>
               <w:lang w:val="nl-NL"/>
             </w:rPr>
@@ -2107,7 +2147,7 @@
         </w:p>
         <w:p>
           <w:pPr>
-            <w:pStyle w:val="Kop2"/>
+            <w:pStyle w:val="Heading2"/>
             <w:rPr>
               <w:lang w:val="nl-NL"/>
             </w:rPr>
@@ -2134,7 +2174,7 @@
         </w:p>
         <w:p>
           <w:pPr>
-            <w:pStyle w:val="Kop1"/>
+            <w:pStyle w:val="Heading1"/>
             <w:rPr>
               <w:lang w:val="nl-NL"/>
             </w:rPr>
@@ -2195,6 +2235,12 @@
             </w:rPr>
             <w:t>Technische complexiteit</w:t>
           </w:r>
+          <w:r>
+            <w:rPr>
+              <w:lang w:val="nl-NL"/>
+            </w:rPr>
+            <w:t xml:space="preserve"> – Is het haalbaal voor ons als studenten?</w:t>
+          </w:r>
         </w:p>
         <w:p>
           <w:pPr>
@@ -2212,6 +2258,21 @@
             </w:rPr>
             <w:t>Kosten</w:t>
           </w:r>
+          <w:r>
+            <w:rPr>
+              <w:lang w:val="nl-NL"/>
+            </w:rPr>
+            <w:t xml:space="preserve"> – Maximale budget van </w:t>
+          </w:r>
+          <w:r>
+            <w:t>€</w:t>
+          </w:r>
+          <w:r>
+            <w:rPr>
+              <w:lang w:val="nl-NL"/>
+            </w:rPr>
+            <w:t>100,-</w:t>
+          </w:r>
         </w:p>
         <w:p>
           <w:pPr>
@@ -2227,7 +2288,7 @@
             <w:rPr>
               <w:lang w:val="nl-NL"/>
             </w:rPr>
-            <w:t>Toepasbaarheid in niet-maritieme systemen</w:t>
+            <w:t>Veiligheid – Hoe veilig is het om hiermee te werken in een schoolomgeving?</w:t>
           </w:r>
         </w:p>
         <w:p>
@@ -2239,7 +2300,7 @@
         </w:p>
         <w:p>
           <w:pPr>
-            <w:pStyle w:val="Kop1"/>
+            <w:pStyle w:val="Heading1"/>
             <w:rPr>
               <w:lang w:val="nl-NL"/>
             </w:rPr>
@@ -2248,6 +2309,7 @@
             <w:rPr>
               <w:lang w:val="nl-NL"/>
             </w:rPr>
+            <w:lastRenderedPageBreak/>
             <w:t xml:space="preserve">Resultaten </w:t>
           </w:r>
         </w:p>
@@ -2255,7 +2317,7 @@
     </w:sdt>
     <w:p>
       <w:pPr>
-        <w:pStyle w:val="Kop2"/>
+        <w:pStyle w:val="Heading2"/>
         <w:rPr>
           <w:lang w:val="nl-NL"/>
         </w:rPr>
@@ -2278,24 +2340,103 @@
       </w:pPr>
       <w:r>
         <w:rPr>
+          <w:noProof/>
+        </w:rPr>
+        <w:drawing>
+          <wp:anchor distT="0" distB="0" distL="114300" distR="114300" simplePos="0" relativeHeight="251659267" behindDoc="0" locked="0" layoutInCell="1" allowOverlap="1" wp14:anchorId="64141DFF" wp14:editId="46FC0B81">
+            <wp:simplePos x="0" y="0"/>
+            <wp:positionH relativeFrom="margin">
+              <wp:align>left</wp:align>
+            </wp:positionH>
+            <wp:positionV relativeFrom="paragraph">
+              <wp:posOffset>510435</wp:posOffset>
+            </wp:positionV>
+            <wp:extent cx="2835275" cy="1953895"/>
+            <wp:effectExtent l="0" t="0" r="3175" b="8255"/>
+            <wp:wrapTopAndBottom/>
+            <wp:docPr id="980606396" name="Picture 1" descr="Semi-Aspirated System"/>
+            <wp:cNvGraphicFramePr>
+              <a:graphicFrameLocks xmlns:a="http://schemas.openxmlformats.org/drawingml/2006/main" noChangeAspect="1"/>
+            </wp:cNvGraphicFramePr>
+            <a:graphic xmlns:a="http://schemas.openxmlformats.org/drawingml/2006/main">
+              <a:graphicData uri="http://schemas.openxmlformats.org/drawingml/2006/picture">
+                <pic:pic xmlns:pic="http://schemas.openxmlformats.org/drawingml/2006/picture">
+                  <pic:nvPicPr>
+                    <pic:cNvPr id="0" name="Picture 1" descr="Semi-Aspirated System"/>
+                    <pic:cNvPicPr>
+                      <a:picLocks noChangeAspect="1" noChangeArrowheads="1"/>
+                    </pic:cNvPicPr>
+                  </pic:nvPicPr>
+                  <pic:blipFill>
+                    <a:blip r:embed="rId12" cstate="print">
+                      <a:extLst>
+                        <a:ext uri="{28A0092B-C50C-407E-A947-70E740481C1C}">
+                          <a14:useLocalDpi xmlns:a14="http://schemas.microsoft.com/office/drawing/2010/main" val="0"/>
+                        </a:ext>
+                      </a:extLst>
+                    </a:blip>
+                    <a:srcRect/>
+                    <a:stretch>
+                      <a:fillRect/>
+                    </a:stretch>
+                  </pic:blipFill>
+                  <pic:spPr bwMode="auto">
+                    <a:xfrm>
+                      <a:off x="0" y="0"/>
+                      <a:ext cx="2846922" cy="1962123"/>
+                    </a:xfrm>
+                    <a:prstGeom prst="rect">
+                      <a:avLst/>
+                    </a:prstGeom>
+                    <a:noFill/>
+                    <a:ln>
+                      <a:noFill/>
+                    </a:ln>
+                  </pic:spPr>
+                </pic:pic>
+              </a:graphicData>
+            </a:graphic>
+            <wp14:sizeRelH relativeFrom="margin">
+              <wp14:pctWidth>0</wp14:pctWidth>
+            </wp14:sizeRelH>
+            <wp14:sizeRelV relativeFrom="margin">
+              <wp14:pctHeight>0</wp14:pctHeight>
+            </wp14:sizeRelV>
+          </wp:anchor>
+        </w:drawing>
+      </w:r>
+      <w:r>
+        <w:rPr>
           <w:lang w:val="nl-NL"/>
         </w:rPr>
         <w:t>Deze is een Hybride van de Low Pressure en Compressed Air ballast systemen. Deze is bedoelt om te gebruiken bij een onderzeeër, en is ook het meest ingewikkeld.</w:t>
+      </w:r>
+      <w:bookmarkStart w:id="2" w:name="_Toc213669762"/>
+    </w:p>
+    <w:p>
+      <w:r>
+        <w:rPr>
+          <w:i/>
+          <w:iCs/>
+        </w:rPr>
+        <w:t>Nautilus Drydocks RC Submarine Technology</w:t>
+      </w:r>
+      <w:r>
+        <w:t xml:space="preserve"> </w:t>
+      </w:r>
+      <w:r>
+        <w:rPr>
+          <w:i/>
+          <w:iCs/>
+        </w:rPr>
+        <w:t>(2025)</w:t>
       </w:r>
     </w:p>
     <w:p>
       <w:pPr>
-        <w:pStyle w:val="Kop2"/>
-        <w:rPr>
-          <w:lang w:val="nl-NL"/>
-        </w:rPr>
-      </w:pPr>
-      <w:bookmarkStart w:id="2" w:name="_Toc213669762"/>
+        <w:pStyle w:val="Heading2"/>
+      </w:pPr>
       <w:r>
-        <w:rPr>
-          <w:lang w:val="nl-NL"/>
-        </w:rPr>
-        <w:lastRenderedPageBreak/>
         <w:t>Recirculating Compressed Air Ballast System</w:t>
       </w:r>
       <w:bookmarkEnd w:id="2"/>
@@ -2327,16 +2468,96 @@
     </w:p>
     <w:p>
       <w:pPr>
-        <w:pStyle w:val="Kop2"/>
-        <w:rPr>
-          <w:lang w:val="nl-NL"/>
-        </w:rPr>
+        <w:rPr>
+          <w:i/>
+          <w:iCs/>
+        </w:rPr>
+      </w:pPr>
+      <w:r>
+        <w:rPr>
+          <w:i/>
+          <w:iCs/>
+        </w:rPr>
+        <w:t>Nautilus Drydocks RC Submarine Technology</w:t>
+      </w:r>
+      <w:r>
+        <w:rPr>
+          <w:noProof/>
+        </w:rPr>
+        <w:drawing>
+          <wp:anchor distT="0" distB="0" distL="114300" distR="114300" simplePos="0" relativeHeight="251660291" behindDoc="0" locked="0" layoutInCell="1" allowOverlap="1" wp14:anchorId="662CECBC" wp14:editId="69EF6F17">
+            <wp:simplePos x="0" y="0"/>
+            <wp:positionH relativeFrom="column">
+              <wp:posOffset>-2757</wp:posOffset>
+            </wp:positionH>
+            <wp:positionV relativeFrom="paragraph">
+              <wp:posOffset>370</wp:posOffset>
+            </wp:positionV>
+            <wp:extent cx="3255382" cy="2067986"/>
+            <wp:effectExtent l="0" t="0" r="2540" b="8890"/>
+            <wp:wrapTopAndBottom/>
+            <wp:docPr id="40846523" name="Picture 2" descr="Recirculating Compressed Air Ballast"/>
+            <wp:cNvGraphicFramePr>
+              <a:graphicFrameLocks xmlns:a="http://schemas.openxmlformats.org/drawingml/2006/main" noChangeAspect="1"/>
+            </wp:cNvGraphicFramePr>
+            <a:graphic xmlns:a="http://schemas.openxmlformats.org/drawingml/2006/main">
+              <a:graphicData uri="http://schemas.openxmlformats.org/drawingml/2006/picture">
+                <pic:pic xmlns:pic="http://schemas.openxmlformats.org/drawingml/2006/picture">
+                  <pic:nvPicPr>
+                    <pic:cNvPr id="0" name="Picture 3" descr="Recirculating Compressed Air Ballast"/>
+                    <pic:cNvPicPr>
+                      <a:picLocks noChangeAspect="1" noChangeArrowheads="1"/>
+                    </pic:cNvPicPr>
+                  </pic:nvPicPr>
+                  <pic:blipFill>
+                    <a:blip r:embed="rId13">
+                      <a:extLst>
+                        <a:ext uri="{28A0092B-C50C-407E-A947-70E740481C1C}">
+                          <a14:useLocalDpi xmlns:a14="http://schemas.microsoft.com/office/drawing/2010/main" val="0"/>
+                        </a:ext>
+                      </a:extLst>
+                    </a:blip>
+                    <a:srcRect/>
+                    <a:stretch>
+                      <a:fillRect/>
+                    </a:stretch>
+                  </pic:blipFill>
+                  <pic:spPr bwMode="auto">
+                    <a:xfrm>
+                      <a:off x="0" y="0"/>
+                      <a:ext cx="3255382" cy="2067986"/>
+                    </a:xfrm>
+                    <a:prstGeom prst="rect">
+                      <a:avLst/>
+                    </a:prstGeom>
+                    <a:noFill/>
+                    <a:ln>
+                      <a:noFill/>
+                    </a:ln>
+                  </pic:spPr>
+                </pic:pic>
+              </a:graphicData>
+            </a:graphic>
+          </wp:anchor>
+        </w:drawing>
+      </w:r>
+      <w:r>
+        <w:t xml:space="preserve"> </w:t>
+      </w:r>
+      <w:r>
+        <w:rPr>
+          <w:i/>
+          <w:iCs/>
+        </w:rPr>
+        <w:t>(2025)</w:t>
+      </w:r>
+    </w:p>
+    <w:p>
+      <w:pPr>
+        <w:pStyle w:val="Heading2"/>
       </w:pPr>
       <w:bookmarkStart w:id="3" w:name="_Toc213669763"/>
       <w:r>
-        <w:rPr>
-          <w:lang w:val="nl-NL"/>
-        </w:rPr>
         <w:t>Vented Low Pressure Ballast System</w:t>
       </w:r>
       <w:bookmarkEnd w:id="3"/>
@@ -2351,21 +2572,131 @@
         <w:rPr>
           <w:lang w:val="nl-NL"/>
         </w:rPr>
-        <w:t xml:space="preserve">Dit systeem maakt gebruik van een luchtvent en waterpomp: Het water word ingepompt en weg laten lopen om het drijfvermogen aan te passen. Het heeft een “flood valve” om water snel in te laten loven of weg te laten lopen. </w:t>
+        <w:t xml:space="preserve">Dit systeem maakt gebruik van een luchtvent en waterpomp: Het water word </w:t>
+      </w:r>
+      <w:r>
+        <w:rPr>
+          <w:lang w:val="nl-NL"/>
+        </w:rPr>
+        <w:t>uitgepompt</w:t>
+      </w:r>
+      <w:r>
+        <w:rPr>
+          <w:lang w:val="nl-NL"/>
+        </w:rPr>
+        <w:t xml:space="preserve"> en </w:t>
+      </w:r>
+      <w:r>
+        <w:rPr>
+          <w:lang w:val="nl-NL"/>
+        </w:rPr>
+        <w:t>in</w:t>
+      </w:r>
+      <w:r>
+        <w:rPr>
+          <w:lang w:val="nl-NL"/>
+        </w:rPr>
+        <w:t xml:space="preserve"> laten lopen om het drijfvermogen aan te passen. Het heeft een “flood valve” om water snel in te laten lo</w:t>
+      </w:r>
+      <w:r>
+        <w:rPr>
+          <w:lang w:val="nl-NL"/>
+        </w:rPr>
+        <w:t>p</w:t>
+      </w:r>
+      <w:r>
+        <w:rPr>
+          <w:lang w:val="nl-NL"/>
+        </w:rPr>
+        <w:t xml:space="preserve">en. </w:t>
       </w:r>
     </w:p>
     <w:p>
       <w:pPr>
-        <w:pStyle w:val="Kop2"/>
         <w:rPr>
           <w:lang w:val="nl-NL"/>
         </w:rPr>
       </w:pPr>
+      <w:r>
+        <w:rPr>
+          <w:noProof/>
+        </w:rPr>
+        <w:drawing>
+          <wp:inline distT="0" distB="0" distL="0" distR="0" wp14:anchorId="3A79F18E" wp14:editId="6EBCDFA8">
+            <wp:extent cx="4236334" cy="1358410"/>
+            <wp:effectExtent l="0" t="0" r="0" b="0"/>
+            <wp:docPr id="421695503" name="Picture 3" descr="Vented Low-Pressure Ballast System"/>
+            <wp:cNvGraphicFramePr>
+              <a:graphicFrameLocks xmlns:a="http://schemas.openxmlformats.org/drawingml/2006/main" noChangeAspect="1"/>
+            </wp:cNvGraphicFramePr>
+            <a:graphic xmlns:a="http://schemas.openxmlformats.org/drawingml/2006/main">
+              <a:graphicData uri="http://schemas.openxmlformats.org/drawingml/2006/picture">
+                <pic:pic xmlns:pic="http://schemas.openxmlformats.org/drawingml/2006/picture">
+                  <pic:nvPicPr>
+                    <pic:cNvPr id="0" name="Picture 5" descr="Vented Low-Pressure Ballast System"/>
+                    <pic:cNvPicPr>
+                      <a:picLocks noChangeAspect="1" noChangeArrowheads="1"/>
+                    </pic:cNvPicPr>
+                  </pic:nvPicPr>
+                  <pic:blipFill>
+                    <a:blip r:embed="rId14">
+                      <a:extLst>
+                        <a:ext uri="{28A0092B-C50C-407E-A947-70E740481C1C}">
+                          <a14:useLocalDpi xmlns:a14="http://schemas.microsoft.com/office/drawing/2010/main" val="0"/>
+                        </a:ext>
+                      </a:extLst>
+                    </a:blip>
+                    <a:srcRect/>
+                    <a:stretch>
+                      <a:fillRect/>
+                    </a:stretch>
+                  </pic:blipFill>
+                  <pic:spPr bwMode="auto">
+                    <a:xfrm>
+                      <a:off x="0" y="0"/>
+                      <a:ext cx="4262468" cy="1366790"/>
+                    </a:xfrm>
+                    <a:prstGeom prst="rect">
+                      <a:avLst/>
+                    </a:prstGeom>
+                    <a:noFill/>
+                    <a:ln>
+                      <a:noFill/>
+                    </a:ln>
+                  </pic:spPr>
+                </pic:pic>
+              </a:graphicData>
+            </a:graphic>
+          </wp:inline>
+        </w:drawing>
+      </w:r>
       <w:bookmarkStart w:id="4" w:name="_Toc213669764"/>
+    </w:p>
+    <w:p>
       <w:r>
         <w:rPr>
-          <w:lang w:val="nl-NL"/>
-        </w:rPr>
+          <w:i/>
+          <w:iCs/>
+        </w:rPr>
+        <w:t>Nautilus Drydocks RC Submarine Technology</w:t>
+      </w:r>
+      <w:r>
+        <w:t xml:space="preserve"> </w:t>
+      </w:r>
+      <w:r>
+        <w:rPr>
+          <w:i/>
+          <w:iCs/>
+        </w:rPr>
+        <w:t>(2025)</w:t>
+      </w:r>
+    </w:p>
+    <w:p>
+      <w:pPr>
+        <w:pStyle w:val="Heading2"/>
+      </w:pPr>
+      <w:r>
+        <w:lastRenderedPageBreak/>
         <w:t>Compressed Gas Ballast System</w:t>
       </w:r>
       <w:bookmarkEnd w:id="4"/>
@@ -2380,21 +2711,105 @@
         <w:rPr>
           <w:lang w:val="nl-NL"/>
         </w:rPr>
-        <w:t xml:space="preserve">Maakt gebruik van liquid air om water de verplaatsen. Liquid air is een gevaarlijke stof, om dat het extreem koud word als het van vloeibaar naar gas gaat. Te gevaarlijk voor dit gebruik. </w:t>
+        <w:t xml:space="preserve">Maakt gebruik van liquid air om water de verplaatsen. Liquid air is een gevaarlijke stof, omdat het extreem koud word als het van vloeibaar naar gas gaat. </w:t>
+      </w:r>
+      <w:r>
+        <w:rPr>
+          <w:noProof/>
+        </w:rPr>
+        <w:drawing>
+          <wp:anchor distT="0" distB="0" distL="114300" distR="114300" simplePos="0" relativeHeight="251661315" behindDoc="0" locked="0" layoutInCell="1" allowOverlap="1" wp14:anchorId="6ADDBD36" wp14:editId="0F3DB09C">
+            <wp:simplePos x="0" y="0"/>
+            <wp:positionH relativeFrom="column">
+              <wp:posOffset>-3175</wp:posOffset>
+            </wp:positionH>
+            <wp:positionV relativeFrom="paragraph">
+              <wp:posOffset>369570</wp:posOffset>
+            </wp:positionV>
+            <wp:extent cx="5760720" cy="1304290"/>
+            <wp:effectExtent l="0" t="0" r="0" b="0"/>
+            <wp:wrapTopAndBottom/>
+            <wp:docPr id="1316719078" name="Picture 4" descr="Compressed Gas Ballast System"/>
+            <wp:cNvGraphicFramePr>
+              <a:graphicFrameLocks xmlns:a="http://schemas.openxmlformats.org/drawingml/2006/main" noChangeAspect="1"/>
+            </wp:cNvGraphicFramePr>
+            <a:graphic xmlns:a="http://schemas.openxmlformats.org/drawingml/2006/main">
+              <a:graphicData uri="http://schemas.openxmlformats.org/drawingml/2006/picture">
+                <pic:pic xmlns:pic="http://schemas.openxmlformats.org/drawingml/2006/picture">
+                  <pic:nvPicPr>
+                    <pic:cNvPr id="0" name="Picture 7" descr="Compressed Gas Ballast System"/>
+                    <pic:cNvPicPr>
+                      <a:picLocks noChangeAspect="1" noChangeArrowheads="1"/>
+                    </pic:cNvPicPr>
+                  </pic:nvPicPr>
+                  <pic:blipFill>
+                    <a:blip r:embed="rId15">
+                      <a:extLst>
+                        <a:ext uri="{28A0092B-C50C-407E-A947-70E740481C1C}">
+                          <a14:useLocalDpi xmlns:a14="http://schemas.microsoft.com/office/drawing/2010/main" val="0"/>
+                        </a:ext>
+                      </a:extLst>
+                    </a:blip>
+                    <a:srcRect/>
+                    <a:stretch>
+                      <a:fillRect/>
+                    </a:stretch>
+                  </pic:blipFill>
+                  <pic:spPr bwMode="auto">
+                    <a:xfrm>
+                      <a:off x="0" y="0"/>
+                      <a:ext cx="5760720" cy="1304290"/>
+                    </a:xfrm>
+                    <a:prstGeom prst="rect">
+                      <a:avLst/>
+                    </a:prstGeom>
+                    <a:noFill/>
+                    <a:ln>
+                      <a:noFill/>
+                    </a:ln>
+                  </pic:spPr>
+                </pic:pic>
+              </a:graphicData>
+            </a:graphic>
+          </wp:anchor>
+        </w:drawing>
       </w:r>
     </w:p>
     <w:p>
       <w:pPr>
-        <w:pStyle w:val="Kop2"/>
-        <w:rPr>
-          <w:lang w:val="nl-NL"/>
+        <w:rPr>
+          <w:i/>
+          <w:iCs/>
         </w:rPr>
       </w:pPr>
       <w:bookmarkStart w:id="5" w:name="_Toc213669765"/>
       <w:r>
         <w:rPr>
-          <w:lang w:val="nl-NL"/>
-        </w:rPr>
+          <w:i/>
+          <w:iCs/>
+        </w:rPr>
+        <w:t>Nautilus Drydocks RC Submarine Technolog</w:t>
+      </w:r>
+      <w:r>
+        <w:rPr>
+          <w:i/>
+          <w:iCs/>
+        </w:rPr>
+        <w:t xml:space="preserve">y </w:t>
+      </w:r>
+      <w:r>
+        <w:rPr>
+          <w:i/>
+          <w:iCs/>
+        </w:rPr>
+        <w:t>(2025)</w:t>
+      </w:r>
+    </w:p>
+    <w:p>
+      <w:pPr>
+        <w:pStyle w:val="Heading2"/>
+      </w:pPr>
+      <w:r>
         <w:t>Pressure Pump Ballast System</w:t>
       </w:r>
       <w:bookmarkEnd w:id="5"/>
@@ -2413,17 +2828,91 @@
       </w:r>
     </w:p>
     <w:p>
-      <w:pPr>
-        <w:pStyle w:val="Kop2"/>
-        <w:rPr>
-          <w:lang w:val="nl-NL"/>
-        </w:rPr>
+      <w:r>
+        <w:rPr>
+          <w:i/>
+          <w:iCs/>
+        </w:rPr>
+        <w:t>Nautilus Drydocks RC Submarine Technology</w:t>
+      </w:r>
+      <w:r>
+        <w:rPr>
+          <w:noProof/>
+        </w:rPr>
+        <w:drawing>
+          <wp:anchor distT="0" distB="0" distL="114300" distR="114300" simplePos="0" relativeHeight="251662339" behindDoc="1" locked="0" layoutInCell="1" allowOverlap="1" wp14:anchorId="4810CF2F" wp14:editId="17D9DAD5">
+            <wp:simplePos x="0" y="0"/>
+            <wp:positionH relativeFrom="column">
+              <wp:posOffset>-2757</wp:posOffset>
+            </wp:positionH>
+            <wp:positionV relativeFrom="paragraph">
+              <wp:posOffset>2251</wp:posOffset>
+            </wp:positionV>
+            <wp:extent cx="5760720" cy="1214755"/>
+            <wp:effectExtent l="0" t="0" r="0" b="4445"/>
+            <wp:wrapTopAndBottom/>
+            <wp:docPr id="785267779" name="Picture 5" descr="Pressure Pump Ballast System"/>
+            <wp:cNvGraphicFramePr>
+              <a:graphicFrameLocks xmlns:a="http://schemas.openxmlformats.org/drawingml/2006/main" noChangeAspect="1"/>
+            </wp:cNvGraphicFramePr>
+            <a:graphic xmlns:a="http://schemas.openxmlformats.org/drawingml/2006/main">
+              <a:graphicData uri="http://schemas.openxmlformats.org/drawingml/2006/picture">
+                <pic:pic xmlns:pic="http://schemas.openxmlformats.org/drawingml/2006/picture">
+                  <pic:nvPicPr>
+                    <pic:cNvPr id="0" name="Picture 9" descr="Pressure Pump Ballast System"/>
+                    <pic:cNvPicPr>
+                      <a:picLocks noChangeAspect="1" noChangeArrowheads="1"/>
+                    </pic:cNvPicPr>
+                  </pic:nvPicPr>
+                  <pic:blipFill>
+                    <a:blip r:embed="rId16">
+                      <a:extLst>
+                        <a:ext uri="{28A0092B-C50C-407E-A947-70E740481C1C}">
+                          <a14:useLocalDpi xmlns:a14="http://schemas.microsoft.com/office/drawing/2010/main" val="0"/>
+                        </a:ext>
+                      </a:extLst>
+                    </a:blip>
+                    <a:srcRect/>
+                    <a:stretch>
+                      <a:fillRect/>
+                    </a:stretch>
+                  </pic:blipFill>
+                  <pic:spPr bwMode="auto">
+                    <a:xfrm>
+                      <a:off x="0" y="0"/>
+                      <a:ext cx="5760720" cy="1214755"/>
+                    </a:xfrm>
+                    <a:prstGeom prst="rect">
+                      <a:avLst/>
+                    </a:prstGeom>
+                    <a:noFill/>
+                    <a:ln>
+                      <a:noFill/>
+                    </a:ln>
+                  </pic:spPr>
+                </pic:pic>
+              </a:graphicData>
+            </a:graphic>
+          </wp:anchor>
+        </w:drawing>
+      </w:r>
+      <w:r>
+        <w:t xml:space="preserve"> </w:t>
+      </w:r>
+      <w:r>
+        <w:rPr>
+          <w:i/>
+          <w:iCs/>
+        </w:rPr>
+        <w:t>(2025)</w:t>
+      </w:r>
+    </w:p>
+    <w:p>
+      <w:pPr>
+        <w:pStyle w:val="Heading2"/>
       </w:pPr>
       <w:bookmarkStart w:id="6" w:name="_Toc213669766"/>
       <w:r>
-        <w:rPr>
-          <w:lang w:val="nl-NL"/>
-        </w:rPr>
         <w:t>Piston Tank Ballast System</w:t>
       </w:r>
       <w:bookmarkEnd w:id="6"/>
@@ -2444,15 +2933,127 @@
     </w:p>
     <w:p>
       <w:pPr>
-        <w:pStyle w:val="Kop2"/>
-        <w:rPr>
+        <w:rPr>
+          <w:rStyle w:val="Heading2Char"/>
           <w:lang w:val="nl-NL"/>
         </w:rPr>
       </w:pPr>
       <w:r>
         <w:rPr>
+          <w:noProof/>
+        </w:rPr>
+        <w:drawing>
+          <wp:inline distT="0" distB="0" distL="0" distR="0" wp14:anchorId="2FAF09F5" wp14:editId="59798A1F">
+            <wp:extent cx="5760720" cy="1031240"/>
+            <wp:effectExtent l="0" t="0" r="0" b="0"/>
+            <wp:docPr id="238109744" name="Picture 6" descr="Piston Tank Ballast System"/>
+            <wp:cNvGraphicFramePr>
+              <a:graphicFrameLocks xmlns:a="http://schemas.openxmlformats.org/drawingml/2006/main" noChangeAspect="1"/>
+            </wp:cNvGraphicFramePr>
+            <a:graphic xmlns:a="http://schemas.openxmlformats.org/drawingml/2006/main">
+              <a:graphicData uri="http://schemas.openxmlformats.org/drawingml/2006/picture">
+                <pic:pic xmlns:pic="http://schemas.openxmlformats.org/drawingml/2006/picture">
+                  <pic:nvPicPr>
+                    <pic:cNvPr id="0" name="Picture 11" descr="Piston Tank Ballast System"/>
+                    <pic:cNvPicPr>
+                      <a:picLocks noChangeAspect="1" noChangeArrowheads="1"/>
+                    </pic:cNvPicPr>
+                  </pic:nvPicPr>
+                  <pic:blipFill>
+                    <a:blip r:embed="rId17">
+                      <a:extLst>
+                        <a:ext uri="{28A0092B-C50C-407E-A947-70E740481C1C}">
+                          <a14:useLocalDpi xmlns:a14="http://schemas.microsoft.com/office/drawing/2010/main" val="0"/>
+                        </a:ext>
+                      </a:extLst>
+                    </a:blip>
+                    <a:srcRect/>
+                    <a:stretch>
+                      <a:fillRect/>
+                    </a:stretch>
+                  </pic:blipFill>
+                  <pic:spPr bwMode="auto">
+                    <a:xfrm>
+                      <a:off x="0" y="0"/>
+                      <a:ext cx="5760720" cy="1031240"/>
+                    </a:xfrm>
+                    <a:prstGeom prst="rect">
+                      <a:avLst/>
+                    </a:prstGeom>
+                    <a:noFill/>
+                    <a:ln>
+                      <a:noFill/>
+                    </a:ln>
+                  </pic:spPr>
+                </pic:pic>
+              </a:graphicData>
+            </a:graphic>
+          </wp:inline>
+        </w:drawing>
+      </w:r>
+    </w:p>
+    <w:p>
+      <w:pPr>
+        <w:rPr>
+          <w:rStyle w:val="Heading2Char"/>
+          <w:i/>
+          <w:iCs/>
+        </w:rPr>
+      </w:pPr>
+      <w:r>
+        <w:rPr>
+          <w:i/>
+          <w:iCs/>
+        </w:rPr>
+        <w:t xml:space="preserve">Nautilus Drydocks RC Submarine </w:t>
+      </w:r>
+      <w:r>
+        <w:rPr>
+          <w:i/>
+          <w:iCs/>
+        </w:rPr>
+        <w:t>Technology</w:t>
+      </w:r>
+      <w:r>
+        <w:rPr>
+          <w:i/>
+          <w:iCs/>
+        </w:rPr>
+        <w:t xml:space="preserve"> </w:t>
+      </w:r>
+      <w:r>
+        <w:rPr>
+          <w:i/>
+          <w:iCs/>
+        </w:rPr>
+        <w:t>(2025)</w:t>
+      </w:r>
+    </w:p>
+    <w:p>
+      <w:pPr>
+        <w:rPr>
+          <w:rStyle w:val="Heading2Char"/>
+        </w:rPr>
+      </w:pPr>
+      <w:r>
+        <w:rPr>
+          <w:rStyle w:val="Heading2Char"/>
+        </w:rPr>
+        <w:br w:type="page"/>
+      </w:r>
+    </w:p>
+    <w:p>
+      <w:pPr>
+        <w:rPr>
           <w:lang w:val="nl-NL"/>
         </w:rPr>
+      </w:pPr>
+      <w:r>
+        <w:rPr>
+          <w:rStyle w:val="Heading2Char"/>
+          <w:lang w:val="nl-NL"/>
+        </w:rPr>
+        <w:lastRenderedPageBreak/>
         <w:t>Compressed Air Ballast System</w:t>
       </w:r>
       <w:bookmarkEnd w:id="7"/>
@@ -2469,21 +3070,82 @@
         </w:rPr>
         <w:t xml:space="preserve">2 kleppen: een voor lucht, en een voor water. Deze gebruikt dus compressie lucht om het drijfvermogen te vergroten, en water van buiten om het te verlagen. </w:t>
       </w:r>
+      <w:r>
+        <w:rPr>
+          <w:noProof/>
+        </w:rPr>
+        <w:drawing>
+          <wp:inline distT="0" distB="0" distL="0" distR="0" wp14:anchorId="19266034" wp14:editId="2DC4CD0C">
+            <wp:extent cx="5795521" cy="2002420"/>
+            <wp:effectExtent l="0" t="0" r="0" b="0"/>
+            <wp:docPr id="763303369" name="Picture 7" descr="Compressed Air Ballast System"/>
+            <wp:cNvGraphicFramePr>
+              <a:graphicFrameLocks xmlns:a="http://schemas.openxmlformats.org/drawingml/2006/main" noChangeAspect="1"/>
+            </wp:cNvGraphicFramePr>
+            <a:graphic xmlns:a="http://schemas.openxmlformats.org/drawingml/2006/main">
+              <a:graphicData uri="http://schemas.openxmlformats.org/drawingml/2006/picture">
+                <pic:pic xmlns:pic="http://schemas.openxmlformats.org/drawingml/2006/picture">
+                  <pic:nvPicPr>
+                    <pic:cNvPr id="0" name="Picture 13" descr="Compressed Air Ballast System"/>
+                    <pic:cNvPicPr>
+                      <a:picLocks noChangeAspect="1" noChangeArrowheads="1"/>
+                    </pic:cNvPicPr>
+                  </pic:nvPicPr>
+                  <pic:blipFill>
+                    <a:blip r:embed="rId18">
+                      <a:extLst>
+                        <a:ext uri="{28A0092B-C50C-407E-A947-70E740481C1C}">
+                          <a14:useLocalDpi xmlns:a14="http://schemas.microsoft.com/office/drawing/2010/main" val="0"/>
+                        </a:ext>
+                      </a:extLst>
+                    </a:blip>
+                    <a:srcRect/>
+                    <a:stretch>
+                      <a:fillRect/>
+                    </a:stretch>
+                  </pic:blipFill>
+                  <pic:spPr bwMode="auto">
+                    <a:xfrm>
+                      <a:off x="0" y="0"/>
+                      <a:ext cx="5813042" cy="2008474"/>
+                    </a:xfrm>
+                    <a:prstGeom prst="rect">
+                      <a:avLst/>
+                    </a:prstGeom>
+                    <a:noFill/>
+                    <a:ln>
+                      <a:noFill/>
+                    </a:ln>
+                  </pic:spPr>
+                </pic:pic>
+              </a:graphicData>
+            </a:graphic>
+          </wp:inline>
+        </w:drawing>
+      </w:r>
     </w:p>
     <w:p>
-      <w:pPr>
-        <w:rPr>
-          <w:lang w:val="nl-NL"/>
-        </w:rPr>
-      </w:pPr>
+      <w:r>
+        <w:rPr>
+          <w:i/>
+          <w:iCs/>
+        </w:rPr>
+        <w:t>Nautilus Drydocks RC Submarine Technology</w:t>
+      </w:r>
+      <w:r>
+        <w:t xml:space="preserve"> </w:t>
+      </w:r>
+      <w:r>
+        <w:rPr>
+          <w:i/>
+          <w:iCs/>
+        </w:rPr>
+        <w:t>(2025)</w:t>
+      </w:r>
     </w:p>
-    <w:p>
-      <w:pPr>
-        <w:rPr>
-          <w:lang w:val="nl-NL"/>
-        </w:rPr>
-      </w:pPr>
-    </w:p>
+    <w:p/>
+    <w:p/>
+    <w:p/>
     <w:p>
       <w:pPr>
         <w:rPr>
@@ -2491,34 +3153,24 @@
           <w:color w:val="2F5496" w:themeColor="accent1" w:themeShade="BF"/>
           <w:sz w:val="32"/>
           <w:szCs w:val="32"/>
-          <w:lang w:val="nl-NL"/>
         </w:rPr>
       </w:pPr>
       <w:r>
-        <w:rPr>
-          <w:lang w:val="nl-NL"/>
-        </w:rPr>
         <w:br w:type="page"/>
       </w:r>
     </w:p>
     <w:p>
       <w:pPr>
-        <w:pStyle w:val="Kop1"/>
-        <w:rPr>
-          <w:lang w:val="nl-NL"/>
-        </w:rPr>
+        <w:pStyle w:val="Heading1"/>
       </w:pPr>
       <w:r>
-        <w:rPr>
-          <w:lang w:val="nl-NL"/>
-        </w:rPr>
         <w:lastRenderedPageBreak/>
         <w:t>Conclusie</w:t>
       </w:r>
     </w:p>
     <w:p>
       <w:pPr>
-        <w:pStyle w:val="Geenafstand"/>
+        <w:pStyle w:val="NoSpacing"/>
         <w:rPr>
           <w:i/>
           <w:iCs/>
@@ -2536,7 +3188,7 @@
     </w:p>
     <w:p>
       <w:pPr>
-        <w:pStyle w:val="Geenafstand"/>
+        <w:pStyle w:val="NoSpacing"/>
         <w:rPr>
           <w:lang w:val="nl-NL"/>
         </w:rPr>
@@ -2544,7 +3196,7 @@
     </w:p>
     <w:p>
       <w:pPr>
-        <w:pStyle w:val="Geenafstand"/>
+        <w:pStyle w:val="NoSpacing"/>
         <w:rPr>
           <w:lang w:val="nl-NL"/>
         </w:rPr>
@@ -2564,7 +3216,7 @@
     </w:p>
     <w:tbl>
       <w:tblPr>
-        <w:tblStyle w:val="Tabelraster"/>
+        <w:tblStyle w:val="TableGrid"/>
         <w:tblW w:w="0" w:type="auto"/>
         <w:tblLook w:val="04A0" w:firstRow="1" w:lastRow="0" w:firstColumn="1" w:lastColumn="0" w:noHBand="0" w:noVBand="1"/>
       </w:tblPr>
@@ -2581,7 +3233,7 @@
           </w:tcPr>
           <w:p>
             <w:pPr>
-              <w:pStyle w:val="Geenafstand"/>
+              <w:pStyle w:val="NoSpacing"/>
               <w:rPr>
                 <w:lang w:val="nl-NL"/>
               </w:rPr>
@@ -2600,7 +3252,7 @@
           </w:tcPr>
           <w:p>
             <w:pPr>
-              <w:pStyle w:val="Geenafstand"/>
+              <w:pStyle w:val="NoSpacing"/>
               <w:rPr>
                 <w:lang w:val="nl-NL"/>
               </w:rPr>
@@ -2619,7 +3271,7 @@
           </w:tcPr>
           <w:p>
             <w:pPr>
-              <w:pStyle w:val="Geenafstand"/>
+              <w:pStyle w:val="NoSpacing"/>
               <w:rPr>
                 <w:lang w:val="nl-NL"/>
               </w:rPr>
@@ -2638,7 +3290,7 @@
           </w:tcPr>
           <w:p>
             <w:pPr>
-              <w:pStyle w:val="Geenafstand"/>
+              <w:pStyle w:val="NoSpacing"/>
               <w:rPr>
                 <w:lang w:val="nl-NL"/>
               </w:rPr>
@@ -2647,7 +3299,7 @@
               <w:rPr>
                 <w:lang w:val="nl-NL"/>
               </w:rPr>
-              <w:t>Budget</w:t>
+              <w:t>Kosten</w:t>
             </w:r>
           </w:p>
         </w:tc>
@@ -2659,7 +3311,7 @@
           </w:tcPr>
           <w:p>
             <w:pPr>
-              <w:pStyle w:val="Geenafstand"/>
+              <w:pStyle w:val="NoSpacing"/>
               <w:rPr>
                 <w:color w:val="FF0000"/>
                 <w:lang w:val="nl-NL"/>
@@ -2680,7 +3332,7 @@
           </w:tcPr>
           <w:p>
             <w:pPr>
-              <w:pStyle w:val="Geenafstand"/>
+              <w:pStyle w:val="NoSpacing"/>
               <w:rPr>
                 <w:color w:val="FF0000"/>
                 <w:lang w:val="nl-NL"/>
@@ -2701,7 +3353,7 @@
           </w:tcPr>
           <w:p>
             <w:pPr>
-              <w:pStyle w:val="Geenafstand"/>
+              <w:pStyle w:val="NoSpacing"/>
               <w:rPr>
                 <w:color w:val="FF0000"/>
                 <w:lang w:val="nl-NL"/>
@@ -2722,7 +3374,7 @@
           </w:tcPr>
           <w:p>
             <w:pPr>
-              <w:pStyle w:val="Geenafstand"/>
+              <w:pStyle w:val="NoSpacing"/>
               <w:rPr>
                 <w:color w:val="FF0000"/>
                 <w:lang w:val="nl-NL"/>
@@ -2745,7 +3397,7 @@
           </w:tcPr>
           <w:p>
             <w:pPr>
-              <w:pStyle w:val="Geenafstand"/>
+              <w:pStyle w:val="NoSpacing"/>
               <w:rPr>
                 <w:color w:val="FF0000"/>
                 <w:lang w:val="nl-NL"/>
@@ -2766,7 +3418,7 @@
           </w:tcPr>
           <w:p>
             <w:pPr>
-              <w:pStyle w:val="Geenafstand"/>
+              <w:pStyle w:val="NoSpacing"/>
               <w:rPr>
                 <w:color w:val="FF0000"/>
                 <w:lang w:val="nl-NL"/>
@@ -2787,7 +3439,7 @@
           </w:tcPr>
           <w:p>
             <w:pPr>
-              <w:pStyle w:val="Geenafstand"/>
+              <w:pStyle w:val="NoSpacing"/>
               <w:rPr>
                 <w:color w:val="FF0000"/>
                 <w:lang w:val="nl-NL"/>
@@ -2808,7 +3460,7 @@
           </w:tcPr>
           <w:p>
             <w:pPr>
-              <w:pStyle w:val="Geenafstand"/>
+              <w:pStyle w:val="NoSpacing"/>
               <w:rPr>
                 <w:color w:val="FF0000"/>
                 <w:lang w:val="nl-NL"/>
@@ -2831,7 +3483,7 @@
           </w:tcPr>
           <w:p>
             <w:pPr>
-              <w:pStyle w:val="Geenafstand"/>
+              <w:pStyle w:val="NoSpacing"/>
               <w:rPr>
                 <w:color w:val="92D050"/>
                 <w:lang w:val="nl-NL"/>
@@ -2852,7 +3504,7 @@
           </w:tcPr>
           <w:p>
             <w:pPr>
-              <w:pStyle w:val="Geenafstand"/>
+              <w:pStyle w:val="NoSpacing"/>
               <w:rPr>
                 <w:color w:val="92D050"/>
                 <w:lang w:val="nl-NL"/>
@@ -2873,7 +3525,7 @@
           </w:tcPr>
           <w:p>
             <w:pPr>
-              <w:pStyle w:val="Geenafstand"/>
+              <w:pStyle w:val="NoSpacing"/>
               <w:rPr>
                 <w:color w:val="92D050"/>
                 <w:lang w:val="nl-NL"/>
@@ -2894,7 +3546,7 @@
           </w:tcPr>
           <w:p>
             <w:pPr>
-              <w:pStyle w:val="Geenafstand"/>
+              <w:pStyle w:val="NoSpacing"/>
               <w:rPr>
                 <w:color w:val="92D050"/>
                 <w:lang w:val="nl-NL"/>
@@ -2917,7 +3569,7 @@
           </w:tcPr>
           <w:p>
             <w:pPr>
-              <w:pStyle w:val="Geenafstand"/>
+              <w:pStyle w:val="NoSpacing"/>
               <w:rPr>
                 <w:color w:val="FF0000"/>
                 <w:lang w:val="nl-NL"/>
@@ -2938,7 +3590,7 @@
           </w:tcPr>
           <w:p>
             <w:pPr>
-              <w:pStyle w:val="Geenafstand"/>
+              <w:pStyle w:val="NoSpacing"/>
               <w:rPr>
                 <w:color w:val="FF0000"/>
                 <w:lang w:val="nl-NL"/>
@@ -2959,7 +3611,7 @@
           </w:tcPr>
           <w:p>
             <w:pPr>
-              <w:pStyle w:val="Geenafstand"/>
+              <w:pStyle w:val="NoSpacing"/>
               <w:rPr>
                 <w:color w:val="FF0000"/>
                 <w:lang w:val="nl-NL"/>
@@ -2980,7 +3632,7 @@
           </w:tcPr>
           <w:p>
             <w:pPr>
-              <w:pStyle w:val="Geenafstand"/>
+              <w:pStyle w:val="NoSpacing"/>
               <w:rPr>
                 <w:color w:val="FF0000"/>
                 <w:lang w:val="nl-NL"/>
@@ -3003,7 +3655,7 @@
           </w:tcPr>
           <w:p>
             <w:pPr>
-              <w:pStyle w:val="Geenafstand"/>
+              <w:pStyle w:val="NoSpacing"/>
               <w:rPr>
                 <w:color w:val="ED7D31" w:themeColor="accent2"/>
                 <w:lang w:val="nl-NL"/>
@@ -3024,7 +3676,7 @@
           </w:tcPr>
           <w:p>
             <w:pPr>
-              <w:pStyle w:val="Geenafstand"/>
+              <w:pStyle w:val="NoSpacing"/>
               <w:rPr>
                 <w:color w:val="ED7D31" w:themeColor="accent2"/>
                 <w:lang w:val="nl-NL"/>
@@ -3045,7 +3697,7 @@
           </w:tcPr>
           <w:p>
             <w:pPr>
-              <w:pStyle w:val="Geenafstand"/>
+              <w:pStyle w:val="NoSpacing"/>
               <w:rPr>
                 <w:color w:val="ED7D31" w:themeColor="accent2"/>
                 <w:lang w:val="nl-NL"/>
@@ -3066,7 +3718,7 @@
           </w:tcPr>
           <w:p>
             <w:pPr>
-              <w:pStyle w:val="Geenafstand"/>
+              <w:pStyle w:val="NoSpacing"/>
               <w:rPr>
                 <w:color w:val="ED7D31" w:themeColor="accent2"/>
                 <w:lang w:val="nl-NL"/>
@@ -3089,7 +3741,7 @@
           </w:tcPr>
           <w:p>
             <w:pPr>
-              <w:pStyle w:val="Geenafstand"/>
+              <w:pStyle w:val="NoSpacing"/>
               <w:rPr>
                 <w:color w:val="ED7D31" w:themeColor="accent2"/>
                 <w:lang w:val="nl-NL"/>
@@ -3110,7 +3762,7 @@
           </w:tcPr>
           <w:p>
             <w:pPr>
-              <w:pStyle w:val="Geenafstand"/>
+              <w:pStyle w:val="NoSpacing"/>
               <w:rPr>
                 <w:color w:val="ED7D31" w:themeColor="accent2"/>
                 <w:lang w:val="nl-NL"/>
@@ -3131,7 +3783,7 @@
           </w:tcPr>
           <w:p>
             <w:pPr>
-              <w:pStyle w:val="Geenafstand"/>
+              <w:pStyle w:val="NoSpacing"/>
               <w:rPr>
                 <w:color w:val="ED7D31" w:themeColor="accent2"/>
                 <w:lang w:val="nl-NL"/>
@@ -3152,7 +3804,7 @@
           </w:tcPr>
           <w:p>
             <w:pPr>
-              <w:pStyle w:val="Geenafstand"/>
+              <w:pStyle w:val="NoSpacing"/>
               <w:rPr>
                 <w:color w:val="ED7D31" w:themeColor="accent2"/>
                 <w:lang w:val="nl-NL"/>
@@ -3175,7 +3827,7 @@
           </w:tcPr>
           <w:p>
             <w:pPr>
-              <w:pStyle w:val="Geenafstand"/>
+              <w:pStyle w:val="NoSpacing"/>
               <w:rPr>
                 <w:color w:val="ED7D31" w:themeColor="accent2"/>
                 <w:lang w:val="nl-NL"/>
@@ -3196,7 +3848,7 @@
           </w:tcPr>
           <w:p>
             <w:pPr>
-              <w:pStyle w:val="Geenafstand"/>
+              <w:pStyle w:val="NoSpacing"/>
               <w:rPr>
                 <w:color w:val="ED7D31" w:themeColor="accent2"/>
                 <w:lang w:val="nl-NL"/>
@@ -3217,7 +3869,7 @@
           </w:tcPr>
           <w:p>
             <w:pPr>
-              <w:pStyle w:val="Geenafstand"/>
+              <w:pStyle w:val="NoSpacing"/>
               <w:rPr>
                 <w:color w:val="ED7D31" w:themeColor="accent2"/>
                 <w:lang w:val="nl-NL"/>
@@ -3238,7 +3890,7 @@
           </w:tcPr>
           <w:p>
             <w:pPr>
-              <w:pStyle w:val="Geenafstand"/>
+              <w:pStyle w:val="NoSpacing"/>
               <w:rPr>
                 <w:color w:val="ED7D31" w:themeColor="accent2"/>
                 <w:lang w:val="nl-NL"/>
@@ -3257,7 +3909,7 @@
     </w:tbl>
     <w:p>
       <w:pPr>
-        <w:pStyle w:val="Geenafstand"/>
+        <w:pStyle w:val="NoSpacing"/>
         <w:rPr>
           <w:lang w:val="nl-NL"/>
         </w:rPr>
@@ -3265,7 +3917,7 @@
     </w:p>
     <w:p>
       <w:pPr>
-        <w:pStyle w:val="Geenafstand"/>
+        <w:pStyle w:val="NoSpacing"/>
         <w:rPr>
           <w:lang w:val="nl-NL"/>
         </w:rPr>
@@ -3286,7 +3938,7 @@
     </w:p>
     <w:p>
       <w:pPr>
-        <w:pStyle w:val="Kop1"/>
+        <w:pStyle w:val="Heading1"/>
       </w:pPr>
       <w:bookmarkStart w:id="8" w:name="_Toc213669769"/>
       <w:r>
@@ -3311,7 +3963,7 @@
       <w:r>
         <w:br/>
       </w:r>
-      <w:hyperlink r:id="rId12" w:history="1">
+      <w:hyperlink r:id="rId19" w:history="1">
         <w:r>
           <w:rPr>
             <w:rStyle w:val="Hyperlink"/>
@@ -3337,12 +3989,24 @@
       <w:r>
         <w:t xml:space="preserve">. Marine Insight. </w:t>
       </w:r>
-      <w:hyperlink r:id="rId13" w:history="1">
+      <w:hyperlink r:id="rId20" w:history="1">
         <w:r>
           <w:rPr>
             <w:rStyle w:val="Hyperlink"/>
           </w:rPr>
-          <w:t>https://www.marineinsight.com/naval-architecture/a-guide-to-ballast-tanks-on-ships/</w:t>
+          <w:t>https://www.marineinsight.com/naval-arc</w:t>
+        </w:r>
+        <w:r>
+          <w:rPr>
+            <w:rStyle w:val="Hyperlink"/>
+          </w:rPr>
+          <w:t>h</w:t>
+        </w:r>
+        <w:r>
+          <w:rPr>
+            <w:rStyle w:val="Hyperlink"/>
+          </w:rPr>
+          <w:t>itecture/a-guide-to-ballast-tanks-on-ships/</w:t>
         </w:r>
       </w:hyperlink>
       <w:r>
@@ -3351,7 +4015,7 @@
     </w:p>
     <w:p>
       <w:pPr>
-        <w:pStyle w:val="Kop1"/>
+        <w:pStyle w:val="Heading1"/>
       </w:pPr>
       <w:bookmarkStart w:id="9" w:name="_Toc213669770"/>
       <w:r>
@@ -3361,7 +4025,7 @@
     </w:p>
     <w:tbl>
       <w:tblPr>
-        <w:tblStyle w:val="Rastertabel2-Accent5"/>
+        <w:tblStyle w:val="GridTable2-Accent5"/>
         <w:tblW w:w="0" w:type="auto"/>
         <w:tblLook w:val="04A0" w:firstRow="1" w:lastRow="0" w:firstColumn="1" w:lastColumn="0" w:noHBand="0" w:noVBand="1"/>
       </w:tblPr>
@@ -3618,6 +4282,65 @@
           </w:p>
         </w:tc>
       </w:tr>
+      <w:tr>
+        <w:tc>
+          <w:tcPr>
+            <w:cnfStyle w:val="001000000000" w:firstRow="0" w:lastRow="0" w:firstColumn="1" w:lastColumn="0" w:oddVBand="0" w:evenVBand="0" w:oddHBand="0" w:evenHBand="0" w:firstRowFirstColumn="0" w:firstRowLastColumn="0" w:lastRowFirstColumn="0" w:lastRowLastColumn="0"/>
+            <w:tcW w:w="3028" w:type="dxa"/>
+          </w:tcPr>
+          <w:p>
+            <w:pPr>
+              <w:rPr>
+                <w:lang w:val="nl-NL"/>
+              </w:rPr>
+            </w:pPr>
+            <w:r>
+              <w:rPr>
+                <w:lang w:val="nl-NL"/>
+              </w:rPr>
+              <w:t>03-02-2026</w:t>
+            </w:r>
+          </w:p>
+        </w:tc>
+        <w:tc>
+          <w:tcPr>
+            <w:tcW w:w="2782" w:type="dxa"/>
+          </w:tcPr>
+          <w:p>
+            <w:pPr>
+              <w:cnfStyle w:val="000000000000" w:firstRow="0" w:lastRow="0" w:firstColumn="0" w:lastColumn="0" w:oddVBand="0" w:evenVBand="0" w:oddHBand="0" w:evenHBand="0" w:firstRowFirstColumn="0" w:firstRowLastColumn="0" w:lastRowFirstColumn="0" w:lastRowLastColumn="0"/>
+              <w:rPr>
+                <w:lang w:val="nl-NL"/>
+              </w:rPr>
+            </w:pPr>
+            <w:r>
+              <w:rPr>
+                <w:lang w:val="nl-NL"/>
+              </w:rPr>
+              <w:t>3.0</w:t>
+            </w:r>
+          </w:p>
+        </w:tc>
+        <w:tc>
+          <w:tcPr>
+            <w:tcW w:w="3206" w:type="dxa"/>
+          </w:tcPr>
+          <w:p>
+            <w:pPr>
+              <w:cnfStyle w:val="000000000000" w:firstRow="0" w:lastRow="0" w:firstColumn="0" w:lastColumn="0" w:oddVBand="0" w:evenVBand="0" w:oddHBand="0" w:evenHBand="0" w:firstRowFirstColumn="0" w:firstRowLastColumn="0" w:lastRowFirstColumn="0" w:lastRowLastColumn="0"/>
+              <w:rPr>
+                <w:lang w:val="nl-NL"/>
+              </w:rPr>
+            </w:pPr>
+            <w:r>
+              <w:rPr>
+                <w:lang w:val="nl-NL"/>
+              </w:rPr>
+              <w:t>Feedback toegepast</w:t>
+            </w:r>
+          </w:p>
+        </w:tc>
+      </w:tr>
     </w:tbl>
     <w:p>
       <w:pPr>
@@ -3634,7 +4357,7 @@
       </w:pPr>
     </w:p>
     <w:sectPr>
-      <w:footerReference w:type="default" r:id="rId14"/>
+      <w:footerReference w:type="default" r:id="rId21"/>
       <w:pgSz w:w="11906" w:h="16838"/>
       <w:pgMar w:top="1417" w:right="1417" w:bottom="1417" w:left="1417" w:header="708" w:footer="708" w:gutter="0"/>
       <w:pgNumType w:start="0"/>
@@ -3686,7 +4409,7 @@
     <w:sdtContent>
       <w:p>
         <w:pPr>
-          <w:pStyle w:val="Voettekst"/>
+          <w:pStyle w:val="Footer"/>
           <w:jc w:val="right"/>
         </w:pPr>
         <w:r>
@@ -3712,7 +4435,7 @@
   </w:sdt>
   <w:p>
     <w:pPr>
-      <w:pStyle w:val="Voettekst"/>
+      <w:pStyle w:val="Footer"/>
     </w:pPr>
   </w:p>
 </w:ftr>
@@ -4881,16 +5604,16 @@
     <w:lsdException w:name="Unresolved Mention" w:semiHidden="1" w:unhideWhenUsed="1"/>
     <w:lsdException w:name="Smart Link" w:semiHidden="1" w:unhideWhenUsed="1"/>
   </w:latentStyles>
-  <w:style w:type="paragraph" w:default="1" w:styleId="Standaard">
+  <w:style w:type="paragraph" w:default="1" w:styleId="Normal">
     <w:name w:val="Normal"/>
     <w:qFormat/>
     <w:rsid w:val="00A266FD"/>
   </w:style>
-  <w:style w:type="paragraph" w:styleId="Kop1">
+  <w:style w:type="paragraph" w:styleId="Heading1">
     <w:name w:val="heading 1"/>
-    <w:basedOn w:val="Standaard"/>
-    <w:next w:val="Standaard"/>
-    <w:link w:val="Kop1Char"/>
+    <w:basedOn w:val="Normal"/>
+    <w:next w:val="Normal"/>
+    <w:link w:val="Heading1Char"/>
     <w:uiPriority w:val="9"/>
     <w:qFormat/>
     <w:rsid w:val="00CF1D52"/>
@@ -4907,11 +5630,11 @@
       <w:szCs w:val="32"/>
     </w:rPr>
   </w:style>
-  <w:style w:type="paragraph" w:styleId="Kop2">
+  <w:style w:type="paragraph" w:styleId="Heading2">
     <w:name w:val="heading 2"/>
-    <w:basedOn w:val="Standaard"/>
-    <w:next w:val="Standaard"/>
-    <w:link w:val="Kop2Char"/>
+    <w:basedOn w:val="Normal"/>
+    <w:next w:val="Normal"/>
+    <w:link w:val="Heading2Char"/>
     <w:uiPriority w:val="9"/>
     <w:unhideWhenUsed/>
     <w:qFormat/>
@@ -4929,11 +5652,11 @@
       <w:szCs w:val="26"/>
     </w:rPr>
   </w:style>
-  <w:style w:type="paragraph" w:styleId="Kop3">
+  <w:style w:type="paragraph" w:styleId="Heading3">
     <w:name w:val="heading 3"/>
-    <w:basedOn w:val="Standaard"/>
-    <w:next w:val="Standaard"/>
-    <w:link w:val="Kop3Char"/>
+    <w:basedOn w:val="Normal"/>
+    <w:next w:val="Normal"/>
+    <w:link w:val="Heading3Char"/>
     <w:uiPriority w:val="9"/>
     <w:unhideWhenUsed/>
     <w:qFormat/>
@@ -4951,12 +5674,12 @@
       <w:szCs w:val="24"/>
     </w:rPr>
   </w:style>
-  <w:style w:type="character" w:default="1" w:styleId="Standaardalinea-lettertype">
+  <w:style w:type="character" w:default="1" w:styleId="DefaultParagraphFont">
     <w:name w:val="Default Paragraph Font"/>
     <w:uiPriority w:val="1"/>
     <w:unhideWhenUsed/>
   </w:style>
-  <w:style w:type="table" w:default="1" w:styleId="Standaardtabel">
+  <w:style w:type="table" w:default="1" w:styleId="TableNormal">
     <w:name w:val="Normal Table"/>
     <w:uiPriority w:val="99"/>
     <w:semiHidden/>
@@ -4971,15 +5694,15 @@
       </w:tblCellMar>
     </w:tblPr>
   </w:style>
-  <w:style w:type="numbering" w:default="1" w:styleId="Geenlijst">
+  <w:style w:type="numbering" w:default="1" w:styleId="NoList">
     <w:name w:val="No List"/>
     <w:uiPriority w:val="99"/>
     <w:semiHidden/>
     <w:unhideWhenUsed/>
   </w:style>
-  <w:style w:type="paragraph" w:styleId="Geenafstand">
+  <w:style w:type="paragraph" w:styleId="NoSpacing">
     <w:name w:val="No Spacing"/>
-    <w:link w:val="GeenafstandChar"/>
+    <w:link w:val="NoSpacingChar"/>
     <w:uiPriority w:val="1"/>
     <w:qFormat/>
     <w:rsid w:val="00CF1D52"/>
@@ -4992,10 +5715,10 @@
       <w14:ligatures w14:val="none"/>
     </w:rPr>
   </w:style>
-  <w:style w:type="character" w:customStyle="1" w:styleId="GeenafstandChar">
-    <w:name w:val="Geen afstand Char"/>
-    <w:basedOn w:val="Standaardalinea-lettertype"/>
-    <w:link w:val="Geenafstand"/>
+  <w:style w:type="character" w:customStyle="1" w:styleId="NoSpacingChar">
+    <w:name w:val="No Spacing Char"/>
+    <w:basedOn w:val="DefaultParagraphFont"/>
+    <w:link w:val="NoSpacing"/>
     <w:uiPriority w:val="1"/>
     <w:rsid w:val="00CF1D52"/>
     <w:rPr>
@@ -5005,10 +5728,10 @@
       <w14:ligatures w14:val="none"/>
     </w:rPr>
   </w:style>
-  <w:style w:type="character" w:customStyle="1" w:styleId="Kop1Char">
-    <w:name w:val="Kop 1 Char"/>
-    <w:basedOn w:val="Standaardalinea-lettertype"/>
-    <w:link w:val="Kop1"/>
+  <w:style w:type="character" w:customStyle="1" w:styleId="Heading1Char">
+    <w:name w:val="Heading 1 Char"/>
+    <w:basedOn w:val="DefaultParagraphFont"/>
+    <w:link w:val="Heading1"/>
     <w:uiPriority w:val="9"/>
     <w:rsid w:val="00CF1D52"/>
     <w:rPr>
@@ -5018,10 +5741,10 @@
       <w:szCs w:val="32"/>
     </w:rPr>
   </w:style>
-  <w:style w:type="paragraph" w:styleId="Kopvaninhoudsopgave">
+  <w:style w:type="paragraph" w:styleId="TOCHeading">
     <w:name w:val="TOC Heading"/>
-    <w:basedOn w:val="Kop1"/>
-    <w:next w:val="Standaard"/>
+    <w:basedOn w:val="Heading1"/>
+    <w:next w:val="Normal"/>
     <w:uiPriority w:val="39"/>
     <w:unhideWhenUsed/>
     <w:qFormat/>
@@ -5034,10 +5757,10 @@
       <w14:ligatures w14:val="none"/>
     </w:rPr>
   </w:style>
-  <w:style w:type="paragraph" w:styleId="Plattetekst">
+  <w:style w:type="paragraph" w:styleId="BodyText">
     <w:name w:val="Body Text"/>
-    <w:basedOn w:val="Standaard"/>
-    <w:link w:val="PlattetekstChar"/>
+    <w:basedOn w:val="Normal"/>
+    <w:link w:val="BodyTextChar"/>
     <w:uiPriority w:val="1"/>
     <w:qFormat/>
     <w:rsid w:val="00892426"/>
@@ -5056,10 +5779,10 @@
       <w14:ligatures w14:val="none"/>
     </w:rPr>
   </w:style>
-  <w:style w:type="character" w:customStyle="1" w:styleId="PlattetekstChar">
-    <w:name w:val="Platte tekst Char"/>
-    <w:basedOn w:val="Standaardalinea-lettertype"/>
-    <w:link w:val="Plattetekst"/>
+  <w:style w:type="character" w:customStyle="1" w:styleId="BodyTextChar">
+    <w:name w:val="Body Text Char"/>
+    <w:basedOn w:val="DefaultParagraphFont"/>
+    <w:link w:val="BodyText"/>
     <w:uiPriority w:val="1"/>
     <w:rsid w:val="00892426"/>
     <w:rPr>
@@ -5071,9 +5794,9 @@
       <w14:ligatures w14:val="none"/>
     </w:rPr>
   </w:style>
-  <w:style w:type="table" w:styleId="Tabelraster">
+  <w:style w:type="table" w:styleId="TableGrid">
     <w:name w:val="Table Grid"/>
-    <w:basedOn w:val="Standaardtabel"/>
+    <w:basedOn w:val="TableNormal"/>
     <w:uiPriority w:val="39"/>
     <w:rsid w:val="00495AFF"/>
     <w:pPr>
@@ -5090,9 +5813,9 @@
       </w:tblBorders>
     </w:tblPr>
   </w:style>
-  <w:style w:type="table" w:styleId="Rastertabel3-Accent1">
+  <w:style w:type="table" w:styleId="GridTable3-Accent1">
     <w:name w:val="Grid Table 3 Accent 1"/>
-    <w:basedOn w:val="Standaardtabel"/>
+    <w:basedOn w:val="TableNormal"/>
     <w:uiPriority w:val="48"/>
     <w:rsid w:val="00495AFF"/>
     <w:pPr>
@@ -5228,7 +5951,7 @@
   </w:style>
   <w:style w:type="character" w:styleId="Hyperlink">
     <w:name w:val="Hyperlink"/>
-    <w:basedOn w:val="Standaardalinea-lettertype"/>
+    <w:basedOn w:val="DefaultParagraphFont"/>
     <w:uiPriority w:val="99"/>
     <w:unhideWhenUsed/>
     <w:rsid w:val="005D4A1E"/>
@@ -5237,9 +5960,9 @@
       <w:u w:val="single"/>
     </w:rPr>
   </w:style>
-  <w:style w:type="character" w:styleId="Onopgelostemelding">
+  <w:style w:type="character" w:styleId="UnresolvedMention">
     <w:name w:val="Unresolved Mention"/>
-    <w:basedOn w:val="Standaardalinea-lettertype"/>
+    <w:basedOn w:val="DefaultParagraphFont"/>
     <w:uiPriority w:val="99"/>
     <w:semiHidden/>
     <w:unhideWhenUsed/>
@@ -5249,10 +5972,10 @@
       <w:shd w:val="clear" w:color="auto" w:fill="E1DFDD"/>
     </w:rPr>
   </w:style>
-  <w:style w:type="character" w:customStyle="1" w:styleId="Kop2Char">
-    <w:name w:val="Kop 2 Char"/>
-    <w:basedOn w:val="Standaardalinea-lettertype"/>
-    <w:link w:val="Kop2"/>
+  <w:style w:type="character" w:customStyle="1" w:styleId="Heading2Char">
+    <w:name w:val="Heading 2 Char"/>
+    <w:basedOn w:val="DefaultParagraphFont"/>
+    <w:link w:val="Heading2"/>
     <w:uiPriority w:val="9"/>
     <w:rsid w:val="00A73B7A"/>
     <w:rPr>
@@ -5262,10 +5985,10 @@
       <w:szCs w:val="26"/>
     </w:rPr>
   </w:style>
-  <w:style w:type="character" w:customStyle="1" w:styleId="Kop3Char">
-    <w:name w:val="Kop 3 Char"/>
-    <w:basedOn w:val="Standaardalinea-lettertype"/>
-    <w:link w:val="Kop3"/>
+  <w:style w:type="character" w:customStyle="1" w:styleId="Heading3Char">
+    <w:name w:val="Heading 3 Char"/>
+    <w:basedOn w:val="DefaultParagraphFont"/>
+    <w:link w:val="Heading3"/>
     <w:uiPriority w:val="9"/>
     <w:rsid w:val="00DF774F"/>
     <w:rPr>
@@ -5275,9 +5998,9 @@
       <w:szCs w:val="24"/>
     </w:rPr>
   </w:style>
-  <w:style w:type="paragraph" w:styleId="Lijstalinea">
+  <w:style w:type="paragraph" w:styleId="ListParagraph">
     <w:name w:val="List Paragraph"/>
-    <w:basedOn w:val="Standaard"/>
+    <w:basedOn w:val="Normal"/>
     <w:uiPriority w:val="34"/>
     <w:qFormat/>
     <w:rsid w:val="002535C7"/>
@@ -5286,10 +6009,10 @@
       <w:contextualSpacing/>
     </w:pPr>
   </w:style>
-  <w:style w:type="paragraph" w:styleId="Inhopg2">
+  <w:style w:type="paragraph" w:styleId="TOC2">
     <w:name w:val="toc 2"/>
-    <w:basedOn w:val="Standaard"/>
-    <w:next w:val="Standaard"/>
+    <w:basedOn w:val="Normal"/>
+    <w:next w:val="Normal"/>
     <w:autoRedefine/>
     <w:uiPriority w:val="39"/>
     <w:unhideWhenUsed/>
@@ -5299,10 +6022,10 @@
       <w:ind w:left="220"/>
     </w:pPr>
   </w:style>
-  <w:style w:type="paragraph" w:styleId="Inhopg3">
+  <w:style w:type="paragraph" w:styleId="TOC3">
     <w:name w:val="toc 3"/>
-    <w:basedOn w:val="Standaard"/>
-    <w:next w:val="Standaard"/>
+    <w:basedOn w:val="Normal"/>
+    <w:next w:val="Normal"/>
     <w:autoRedefine/>
     <w:uiPriority w:val="39"/>
     <w:unhideWhenUsed/>
@@ -5312,9 +6035,9 @@
       <w:ind w:left="440"/>
     </w:pPr>
   </w:style>
-  <w:style w:type="table" w:styleId="Rastertabel4-Accent1">
+  <w:style w:type="table" w:styleId="GridTable4-Accent1">
     <w:name w:val="Grid Table 4 Accent 1"/>
-    <w:basedOn w:val="Standaardtabel"/>
+    <w:basedOn w:val="TableNormal"/>
     <w:uiPriority w:val="49"/>
     <w:rsid w:val="00B2441A"/>
     <w:pPr>
@@ -5388,10 +6111,10 @@
       </w:tcPr>
     </w:tblStylePr>
   </w:style>
-  <w:style w:type="paragraph" w:styleId="Inhopg1">
+  <w:style w:type="paragraph" w:styleId="TOC1">
     <w:name w:val="toc 1"/>
-    <w:basedOn w:val="Standaard"/>
-    <w:next w:val="Standaard"/>
+    <w:basedOn w:val="Normal"/>
+    <w:next w:val="Normal"/>
     <w:autoRedefine/>
     <w:uiPriority w:val="39"/>
     <w:unhideWhenUsed/>
@@ -5400,9 +6123,9 @@
       <w:spacing w:after="100"/>
     </w:pPr>
   </w:style>
-  <w:style w:type="table" w:styleId="Rastertabel2-Accent1">
+  <w:style w:type="table" w:styleId="GridTable2-Accent1">
     <w:name w:val="Grid Table 2 Accent 1"/>
-    <w:basedOn w:val="Standaardtabel"/>
+    <w:basedOn w:val="TableNormal"/>
     <w:uiPriority w:val="47"/>
     <w:rsid w:val="00990091"/>
     <w:pPr>
@@ -5475,9 +6198,9 @@
       </w:tcPr>
     </w:tblStylePr>
   </w:style>
-  <w:style w:type="table" w:styleId="Lijsttabel2-Accent1">
+  <w:style w:type="table" w:styleId="ListTable2-Accent1">
     <w:name w:val="List Table 2 Accent 1"/>
-    <w:basedOn w:val="Standaardtabel"/>
+    <w:basedOn w:val="TableNormal"/>
     <w:uiPriority w:val="47"/>
     <w:rsid w:val="00990091"/>
     <w:pPr>
@@ -5529,9 +6252,9 @@
       </w:tcPr>
     </w:tblStylePr>
   </w:style>
-  <w:style w:type="table" w:styleId="Rastertabel2-Accent5">
+  <w:style w:type="table" w:styleId="GridTable2-Accent5">
     <w:name w:val="Grid Table 2 Accent 5"/>
-    <w:basedOn w:val="Standaardtabel"/>
+    <w:basedOn w:val="TableNormal"/>
     <w:uiPriority w:val="47"/>
     <w:rsid w:val="001721C1"/>
     <w:pPr>
@@ -5604,9 +6327,9 @@
       </w:tcPr>
     </w:tblStylePr>
   </w:style>
-  <w:style w:type="table" w:styleId="Rastertabel4-Accent5">
+  <w:style w:type="table" w:styleId="GridTable4-Accent5">
     <w:name w:val="Grid Table 4 Accent 5"/>
-    <w:basedOn w:val="Standaardtabel"/>
+    <w:basedOn w:val="TableNormal"/>
     <w:uiPriority w:val="49"/>
     <w:rsid w:val="008748B9"/>
     <w:pPr>
@@ -5680,9 +6403,9 @@
       </w:tcPr>
     </w:tblStylePr>
   </w:style>
-  <w:style w:type="table" w:styleId="Onopgemaaktetabel2">
+  <w:style w:type="table" w:styleId="PlainTable2">
     <w:name w:val="Plain Table 2"/>
-    <w:basedOn w:val="Standaardtabel"/>
+    <w:basedOn w:val="TableNormal"/>
     <w:uiPriority w:val="42"/>
     <w:rsid w:val="00A266FD"/>
     <w:pPr>
@@ -5760,9 +6483,9 @@
       </w:tcPr>
     </w:tblStylePr>
   </w:style>
-  <w:style w:type="table" w:styleId="Lijsttabel4-Accent1">
+  <w:style w:type="table" w:styleId="ListTable4-Accent1">
     <w:name w:val="List Table 4 Accent 1"/>
-    <w:basedOn w:val="Standaardtabel"/>
+    <w:basedOn w:val="TableNormal"/>
     <w:uiPriority w:val="49"/>
     <w:rsid w:val="00A266FD"/>
     <w:pPr>
@@ -5834,10 +6557,10 @@
       </w:tcPr>
     </w:tblStylePr>
   </w:style>
-  <w:style w:type="paragraph" w:styleId="Koptekst">
+  <w:style w:type="paragraph" w:styleId="Header">
     <w:name w:val="header"/>
-    <w:basedOn w:val="Standaard"/>
-    <w:link w:val="KoptekstChar"/>
+    <w:basedOn w:val="Normal"/>
+    <w:link w:val="HeaderChar"/>
     <w:uiPriority w:val="99"/>
     <w:unhideWhenUsed/>
     <w:rsid w:val="000F02F3"/>
@@ -5849,17 +6572,17 @@
       <w:spacing w:after="0" w:line="240" w:lineRule="auto"/>
     </w:pPr>
   </w:style>
-  <w:style w:type="character" w:customStyle="1" w:styleId="KoptekstChar">
-    <w:name w:val="Koptekst Char"/>
-    <w:basedOn w:val="Standaardalinea-lettertype"/>
-    <w:link w:val="Koptekst"/>
+  <w:style w:type="character" w:customStyle="1" w:styleId="HeaderChar">
+    <w:name w:val="Header Char"/>
+    <w:basedOn w:val="DefaultParagraphFont"/>
+    <w:link w:val="Header"/>
     <w:uiPriority w:val="99"/>
     <w:rsid w:val="000F02F3"/>
   </w:style>
-  <w:style w:type="paragraph" w:styleId="Voettekst">
+  <w:style w:type="paragraph" w:styleId="Footer">
     <w:name w:val="footer"/>
-    <w:basedOn w:val="Standaard"/>
-    <w:link w:val="VoettekstChar"/>
+    <w:basedOn w:val="Normal"/>
+    <w:link w:val="FooterChar"/>
     <w:uiPriority w:val="99"/>
     <w:unhideWhenUsed/>
     <w:rsid w:val="000F02F3"/>
@@ -5871,18 +6594,18 @@
       <w:spacing w:after="0" w:line="240" w:lineRule="auto"/>
     </w:pPr>
   </w:style>
-  <w:style w:type="character" w:customStyle="1" w:styleId="VoettekstChar">
-    <w:name w:val="Voettekst Char"/>
-    <w:basedOn w:val="Standaardalinea-lettertype"/>
-    <w:link w:val="Voettekst"/>
+  <w:style w:type="character" w:customStyle="1" w:styleId="FooterChar">
+    <w:name w:val="Footer Char"/>
+    <w:basedOn w:val="DefaultParagraphFont"/>
+    <w:link w:val="Footer"/>
     <w:uiPriority w:val="99"/>
     <w:rsid w:val="000F02F3"/>
   </w:style>
-  <w:style w:type="paragraph" w:styleId="Titel">
+  <w:style w:type="paragraph" w:styleId="Title">
     <w:name w:val="Title"/>
-    <w:basedOn w:val="Standaard"/>
-    <w:next w:val="Standaard"/>
-    <w:link w:val="TitelChar"/>
+    <w:basedOn w:val="Normal"/>
+    <w:next w:val="Normal"/>
+    <w:link w:val="TitleChar"/>
     <w:uiPriority w:val="10"/>
     <w:qFormat/>
     <w:rsid w:val="00FE7BC5"/>
@@ -5899,10 +6622,10 @@
       <w:lang w:val="nl-NL"/>
     </w:rPr>
   </w:style>
-  <w:style w:type="character" w:customStyle="1" w:styleId="TitelChar">
-    <w:name w:val="Titel Char"/>
-    <w:basedOn w:val="Standaardalinea-lettertype"/>
-    <w:link w:val="Titel"/>
+  <w:style w:type="character" w:customStyle="1" w:styleId="TitleChar">
+    <w:name w:val="Title Char"/>
+    <w:basedOn w:val="DefaultParagraphFont"/>
+    <w:link w:val="Title"/>
     <w:uiPriority w:val="10"/>
     <w:rsid w:val="00FE7BC5"/>
     <w:rPr>
@@ -5914,9 +6637,9 @@
       <w:lang w:val="nl-NL"/>
     </w:rPr>
   </w:style>
-  <w:style w:type="paragraph" w:styleId="Normaalweb">
+  <w:style w:type="paragraph" w:styleId="NormalWeb">
     <w:name w:val="Normal (Web)"/>
-    <w:basedOn w:val="Standaard"/>
+    <w:basedOn w:val="Normal"/>
     <w:uiPriority w:val="99"/>
     <w:semiHidden/>
     <w:unhideWhenUsed/>
@@ -5925,6 +6648,18 @@
       <w:rFonts w:ascii="Times New Roman" w:hAnsi="Times New Roman" w:cs="Times New Roman"/>
       <w:sz w:val="24"/>
       <w:szCs w:val="24"/>
+    </w:rPr>
+  </w:style>
+  <w:style w:type="character" w:styleId="FollowedHyperlink">
+    <w:name w:val="FollowedHyperlink"/>
+    <w:basedOn w:val="DefaultParagraphFont"/>
+    <w:uiPriority w:val="99"/>
+    <w:semiHidden/>
+    <w:unhideWhenUsed/>
+    <w:rsid w:val="00D84569"/>
+    <w:rPr>
+      <w:color w:val="954F72" w:themeColor="followedHyperlink"/>
+      <w:u w:val="single"/>
     </w:rPr>
   </w:style>
 </w:styles>
@@ -6241,23 +6976,6 @@
 </file>
 
 <file path=customXml/item3.xml><?xml version="1.0" encoding="utf-8"?>
-<p:properties xmlns:p="http://schemas.microsoft.com/office/2006/metadata/properties" xmlns:xsi="http://www.w3.org/2001/XMLSchema-instance" xmlns:pc="http://schemas.microsoft.com/office/infopath/2007/PartnerControls">
-  <documentManagement>
-    <_activity xmlns="8d5dcd13-9b93-4860-8686-258dec0e23be" xsi:nil="true"/>
-  </documentManagement>
-</p:properties>
-</file>
-
-<file path=customXml/item4.xml><?xml version="1.0" encoding="utf-8"?>
-<?mso-contentType ?>
-<FormTemplates xmlns="http://schemas.microsoft.com/sharepoint/v3/contenttype/forms">
-  <Display>DocumentLibraryForm</Display>
-  <Edit>DocumentLibraryForm</Edit>
-  <New>DocumentLibraryForm</New>
-</FormTemplates>
-</file>
-
-<file path=customXml/item5.xml><?xml version="1.0" encoding="utf-8"?>
 <ct:contentTypeSchema xmlns:ct="http://schemas.microsoft.com/office/2006/metadata/contentType" xmlns:ma="http://schemas.microsoft.com/office/2006/metadata/properties/metaAttributes" ct:_="" ma:_="" ma:contentTypeName="Document" ma:contentTypeID="0x01010079D7DB9D69D51D4199EBB83E098F6C13" ma:contentTypeVersion="12" ma:contentTypeDescription="Create a new document." ma:contentTypeScope="" ma:versionID="eb751cc31b5c526296a2324007e8a4b3">
   <xsd:schema xmlns:xsd="http://www.w3.org/2001/XMLSchema" xmlns:xs="http://www.w3.org/2001/XMLSchema" xmlns:p="http://schemas.microsoft.com/office/2006/metadata/properties" xmlns:ns3="8d5dcd13-9b93-4860-8686-258dec0e23be" targetNamespace="http://schemas.microsoft.com/office/2006/metadata/properties" ma:root="true" ma:fieldsID="d59be4b08a6b2f92c695cf8a7b4bdc72" ns3:_="">
     <xsd:import namespace="8d5dcd13-9b93-4860-8686-258dec0e23be"/>
@@ -6451,6 +7169,23 @@
 </ct:contentTypeSchema>
 </file>
 
+<file path=customXml/item4.xml><?xml version="1.0" encoding="utf-8"?>
+<?mso-contentType ?>
+<FormTemplates xmlns="http://schemas.microsoft.com/sharepoint/v3/contenttype/forms">
+  <Display>DocumentLibraryForm</Display>
+  <Edit>DocumentLibraryForm</Edit>
+  <New>DocumentLibraryForm</New>
+</FormTemplates>
+</file>
+
+<file path=customXml/item5.xml><?xml version="1.0" encoding="utf-8"?>
+<p:properties xmlns:p="http://schemas.microsoft.com/office/2006/metadata/properties" xmlns:xsi="http://www.w3.org/2001/XMLSchema-instance" xmlns:pc="http://schemas.microsoft.com/office/infopath/2007/PartnerControls">
+  <documentManagement>
+    <_activity xmlns="8d5dcd13-9b93-4860-8686-258dec0e23be" xsi:nil="true"/>
+  </documentManagement>
+</p:properties>
+</file>
+
 <file path=customXml/itemProps1.xml><?xml version="1.0" encoding="utf-8"?>
 <ds:datastoreItem xmlns:ds="http://schemas.openxmlformats.org/officeDocument/2006/customXml" ds:itemID="{55AF091B-3C7A-41E3-B477-F2FDAA23CFDA}">
   <ds:schemaRefs>
@@ -6468,24 +7203,6 @@
 </file>
 
 <file path=customXml/itemProps3.xml><?xml version="1.0" encoding="utf-8"?>
-<ds:datastoreItem xmlns:ds="http://schemas.openxmlformats.org/officeDocument/2006/customXml" ds:itemID="{86D09D52-1029-4077-BDC7-28D8BEFE2835}">
-  <ds:schemaRefs>
-    <ds:schemaRef ds:uri="http://schemas.microsoft.com/office/2006/metadata/properties"/>
-    <ds:schemaRef ds:uri="http://schemas.microsoft.com/office/infopath/2007/PartnerControls"/>
-    <ds:schemaRef ds:uri="8d5dcd13-9b93-4860-8686-258dec0e23be"/>
-  </ds:schemaRefs>
-</ds:datastoreItem>
-</file>
-
-<file path=customXml/itemProps4.xml><?xml version="1.0" encoding="utf-8"?>
-<ds:datastoreItem xmlns:ds="http://schemas.openxmlformats.org/officeDocument/2006/customXml" ds:itemID="{70A85C5D-3D95-48EF-BA3B-DB4B30942479}">
-  <ds:schemaRefs>
-    <ds:schemaRef ds:uri="http://schemas.microsoft.com/sharepoint/v3/contenttype/forms"/>
-  </ds:schemaRefs>
-</ds:datastoreItem>
-</file>
-
-<file path=customXml/itemProps5.xml><?xml version="1.0" encoding="utf-8"?>
 <ds:datastoreItem xmlns:ds="http://schemas.openxmlformats.org/officeDocument/2006/customXml" ds:itemID="{4319BAAC-28BF-4EBE-A25C-894B65DC57D7}">
   <ds:schemaRefs>
     <ds:schemaRef ds:uri="http://schemas.microsoft.com/office/2006/metadata/contentType"/>
@@ -6501,4 +7218,22 @@
     <ds:schemaRef ds:uri="http://schemas.microsoft.com/internal/obd"/>
   </ds:schemaRefs>
 </ds:datastoreItem>
+</file>
+
+<file path=customXml/itemProps4.xml><?xml version="1.0" encoding="utf-8"?>
+<ds:datastoreItem xmlns:ds="http://schemas.openxmlformats.org/officeDocument/2006/customXml" ds:itemID="{70A85C5D-3D95-48EF-BA3B-DB4B30942479}">
+  <ds:schemaRefs>
+    <ds:schemaRef ds:uri="http://schemas.microsoft.com/sharepoint/v3/contenttype/forms"/>
+  </ds:schemaRefs>
+</ds:datastoreItem>
+</file>
+
+<file path=customXml/itemProps5.xml><?xml version="1.0" encoding="utf-8"?>
+<ds:datastoreItem xmlns:ds="http://schemas.openxmlformats.org/officeDocument/2006/customXml" ds:itemID="{86D09D52-1029-4077-BDC7-28D8BEFE2835}">
+  <ds:schemaRefs>
+    <ds:schemaRef ds:uri="http://schemas.microsoft.com/office/2006/metadata/properties"/>
+    <ds:schemaRef ds:uri="http://schemas.microsoft.com/office/infopath/2007/PartnerControls"/>
+    <ds:schemaRef ds:uri="8d5dcd13-9b93-4860-8686-258dec0e23be"/>
+  </ds:schemaRefs>
+</ds:datastoreItem>
 </file>
</xml_diff>